<commit_message>
Add document 0 forms, dark CSS, and CSRF
Add a new document-0 form (admin + applicant) for the teaching-evaluation memo and wire it into auto-draft/preview. Update PositionRequestService to include label for doc 0 and treat it as an admin-managed doc. Enhance doc_preview.js: read XSRF-TOKEN from cookies, send X-XSRF-TOKEN header, upgrade docx-preview, and enable renderDrawing. Extend dark-theme.css with form/control and card styling for dark mode. Several existing admin templates (doc_form_1, 2, 4, 6) received UI/field additions and dynamic row helpers (work/PI/other positions/speakers/etc.). Add Phase2 .docx templates (and temporary Office files) and remove a user-uploaded mp4. Minor static .DS_Store updates included.
</commit_message>
<xml_diff>
--- a/HRCP-KKU-Academic/src/main/resources/templates/docx/Phase2/p2doc_2.docx
+++ b/HRCP-KKU-Academic/src/main/resources/templates/docx/Phase2/p2doc_2.docx
@@ -137,18 +137,8 @@
           <w:sz w:val="32"/>
           <w:szCs w:val="32"/>
         </w:rPr>
-        <w:t>{{title}}{{</w:t>
-      </w:r>
-      <w:proofErr w:type="spellStart"/>
-      <w:r>
-        <w:rPr>
-          <w:rFonts w:ascii="TH Sarabun New" w:hAnsi="TH Sarabun New" w:cs="TH Sarabun New"/>
-          <w:sz w:val="32"/>
-          <w:szCs w:val="32"/>
-        </w:rPr>
-        <w:t>applicant_name</w:t>
-      </w:r>
-      <w:proofErr w:type="spellEnd"/>
+        <w:t>{{title}}{{applicant_name</w:t>
+      </w:r>
       <w:r>
         <w:rPr>
           <w:rFonts w:ascii="TH Sarabun New" w:hAnsi="TH Sarabun New" w:cs="TH Sarabun New"/>
@@ -180,25 +170,7 @@
           <w:sz w:val="32"/>
           <w:szCs w:val="32"/>
         </w:rPr>
-        <w:t>{{</w:t>
-      </w:r>
-      <w:proofErr w:type="spellStart"/>
-      <w:r>
-        <w:rPr>
-          <w:rFonts w:ascii="TH Sarabun New" w:hAnsi="TH Sarabun New" w:cs="TH Sarabun New"/>
-          <w:sz w:val="32"/>
-          <w:szCs w:val="32"/>
-        </w:rPr>
-        <w:t>current_position</w:t>
-      </w:r>
-      <w:proofErr w:type="spellEnd"/>
-      <w:r>
-        <w:rPr>
-          <w:rFonts w:ascii="TH Sarabun New" w:hAnsi="TH Sarabun New" w:cs="TH Sarabun New"/>
-          <w:sz w:val="32"/>
-          <w:szCs w:val="32"/>
-        </w:rPr>
-        <w:t>}}</w:t>
+        <w:t>{{current_position}}</w:t>
       </w:r>
       <w:r>
         <w:rPr>
@@ -260,25 +232,7 @@
           <w:sz w:val="32"/>
           <w:szCs w:val="32"/>
         </w:rPr>
-        <w:t>{{</w:t>
-      </w:r>
-      <w:proofErr w:type="spellStart"/>
-      <w:r>
-        <w:rPr>
-          <w:rFonts w:ascii="TH Sarabun New" w:hAnsi="TH Sarabun New" w:cs="TH Sarabun New"/>
-          <w:sz w:val="32"/>
-          <w:szCs w:val="32"/>
-        </w:rPr>
-        <w:t>request_position</w:t>
-      </w:r>
-      <w:proofErr w:type="spellEnd"/>
-      <w:r>
-        <w:rPr>
-          <w:rFonts w:ascii="TH Sarabun New" w:hAnsi="TH Sarabun New" w:cs="TH Sarabun New"/>
-          <w:sz w:val="32"/>
-          <w:szCs w:val="32"/>
-        </w:rPr>
-        <w:t>}}</w:t>
+        <w:t>{{request_position}}</w:t>
       </w:r>
       <w:r>
         <w:rPr>
@@ -359,7 +313,6 @@
         </w:rPr>
         <w:t>{{</w:t>
       </w:r>
-      <w:proofErr w:type="spellStart"/>
       <w:r>
         <w:rPr>
           <w:rFonts w:ascii="TH Sarabun New" w:hAnsi="TH Sarabun New" w:cs="TH Sarabun New"/>
@@ -368,7 +321,6 @@
         </w:rPr>
         <w:t>wish_to_know_committee_names</w:t>
       </w:r>
-      <w:proofErr w:type="spellEnd"/>
       <w:r>
         <w:rPr>
           <w:rFonts w:ascii="TH Sarabun New" w:hAnsi="TH Sarabun New" w:cs="TH Sarabun New"/>
@@ -420,7 +372,6 @@
         </w:rPr>
         <w:t>{{</w:t>
       </w:r>
-      <w:proofErr w:type="spellStart"/>
       <w:r>
         <w:rPr>
           <w:rFonts w:ascii="TH Sarabun New" w:hAnsi="TH Sarabun New" w:cs="TH Sarabun New"/>
@@ -429,7 +380,6 @@
         </w:rPr>
         <w:t>wish_to_know_committee_names</w:t>
       </w:r>
-      <w:proofErr w:type="spellEnd"/>
       <w:r>
         <w:rPr>
           <w:rFonts w:ascii="TH Sarabun New" w:hAnsi="TH Sarabun New" w:cs="TH Sarabun New"/>
@@ -541,21 +491,7 @@
         <w:rPr>
           <w:rFonts w:ascii="TH Sarabun New" w:hAnsi="TH Sarabun New" w:cs="TH Sarabun New"/>
         </w:rPr>
-        <w:t>…</w:t>
-      </w:r>
-      <w:proofErr w:type="gramStart"/>
-      <w:r>
-        <w:rPr>
-          <w:rFonts w:ascii="TH Sarabun New" w:hAnsi="TH Sarabun New" w:cs="TH Sarabun New"/>
-        </w:rPr>
-        <w:t>…..</w:t>
-      </w:r>
-      <w:proofErr w:type="gramEnd"/>
-      <w:r>
-        <w:rPr>
-          <w:rFonts w:ascii="TH Sarabun New" w:hAnsi="TH Sarabun New" w:cs="TH Sarabun New"/>
-        </w:rPr>
-        <w:t>(</w:t>
+        <w:t>……..(</w:t>
       </w:r>
       <w:r>
         <w:rPr>
@@ -590,21 +526,7 @@
         <w:rPr>
           <w:rFonts w:ascii="TH Sarabun New" w:hAnsi="TH Sarabun New" w:cs="TH Sarabun New"/>
         </w:rPr>
-        <w:t>{{title}}{{</w:t>
-      </w:r>
-      <w:proofErr w:type="spellStart"/>
-      <w:r>
-        <w:rPr>
-          <w:rFonts w:ascii="TH Sarabun New" w:hAnsi="TH Sarabun New" w:cs="TH Sarabun New"/>
-        </w:rPr>
-        <w:t>applicant_name</w:t>
-      </w:r>
-      <w:proofErr w:type="spellEnd"/>
-      <w:r>
-        <w:rPr>
-          <w:rFonts w:ascii="TH Sarabun New" w:hAnsi="TH Sarabun New" w:cs="TH Sarabun New"/>
-        </w:rPr>
-        <w:t>}}</w:t>
+        <w:t>{{title}}{{applicant_name}}</w:t>
       </w:r>
       <w:r>
         <w:rPr>
@@ -1088,7 +1010,9 @@
   </w:style>
   <w:style w:type="character" w:default="1" w:styleId="DefaultParagraphFont">
     <w:name w:val="Default Paragraph Font"/>
+    <w:uiPriority w:val="1"/>
     <w:semiHidden/>
+    <w:unhideWhenUsed/>
   </w:style>
   <w:style w:type="table" w:default="1" w:styleId="TableNormal">
     <w:name w:val="Normal Table"/>

</xml_diff>